<commit_message>
Cycle 048: complete Gemini sync E2E and schema recovery
</commit_message>
<xml_diff>
--- a/PRDCP_v2_Developer_Guide.docx
+++ b/PRDCP_v2_Developer_Guide.docx
@@ -3959,7 +3959,18 @@
         <w:rPr>
           <w:rFonts w:ascii="Calibri" w:hAnsi="Calibri" w:eastAsia="Yu Gothic"/>
         </w:rPr>
-        <w:t>異なるmodelのcontract/capability repairは専用authorizationと互換bindingを持つ。</w:t>
+        <w:t>応答契約のcontract/capability repairは異なるmodel、request-schema repairは名前付きwire revision一致時だけ同じmodelを許可する。</w:t>
+      </w:r>
+    </w:p>
+    <w:p>
+      <w:pPr>
+        <w:pStyle w:val="ListBullet"/>
+      </w:pPr>
+      <w:r>
+        <w:rPr>
+          <w:rFonts w:ascii="Calibri" w:hAnsi="Calibri" w:eastAsia="Yu Gothic"/>
+        </w:rPr>
+        <w:t>同一modelのschema repairは互換bindingを作らず、distinct-model repairだけが専用bindingを持つ。</w:t>
       </w:r>
     </w:p>
     <w:p>
@@ -4448,6 +4459,62 @@
                 <w:rFonts w:ascii="Calibri" w:hAnsi="Calibri" w:eastAsia="Yu Gothic"/>
               </w:rPr>
               <w:t>Retrieval Agentは長いtitle/URL/excerptではなく短いsource_idだけをenum拘束し、保存Contextからidentityを決定論的に復元します。</w:t>
+            </w:r>
+          </w:p>
+        </w:tc>
+      </w:tr>
+    </w:tbl>
+    <w:p>
+      <w:pPr>
+        <w:spacing w:after="0"/>
+      </w:pPr>
+    </w:p>
+    <w:tbl>
+      <w:tblPr>
+        <w:tblStyle w:val="TableGrid"/>
+        <w:tblW w:type="dxa" w:w="9360"/>
+        <w:jc w:val="left"/>
+        <w:tblLayout w:type="fixed"/>
+        <w:tblLook w:firstColumn="1" w:firstRow="1" w:lastColumn="0" w:lastRow="0" w:noHBand="0" w:noVBand="1" w:val="04A0"/>
+        <w:tblInd w:w="120" w:type="dxa"/>
+      </w:tblPr>
+      <w:tblGrid>
+        <w:gridCol w:w="9360"/>
+      </w:tblGrid>
+      <w:tr>
+        <w:trPr>
+          <w:tblHeader w:val="true"/>
+          <w:cantSplit w:val="true"/>
+        </w:trPr>
+        <w:tc>
+          <w:tcPr>
+            <w:tcW w:type="dxa" w:w="9360"/>
+            <w:shd w:fill="E8EEF5"/>
+            <w:vAlign w:val="center"/>
+            <w:tcMar>
+              <w:top w:w="80" w:type="dxa"/>
+              <w:start w:w="120" w:type="dxa"/>
+              <w:bottom w:w="80" w:type="dxa"/>
+              <w:end w:w="120" w:type="dxa"/>
+            </w:tcMar>
+          </w:tcPr>
+          <w:p>
+            <w:pPr>
+              <w:spacing w:before="40" w:after="40"/>
+            </w:pPr>
+            <w:r>
+              <w:rPr>
+                <w:rFonts w:ascii="Calibri" w:hAnsi="Calibri" w:eastAsia="Yu Gothic"/>
+                <w:b/>
+                <w:color w:val="18324A"/>
+              </w:rPr>
+              <w:t xml:space="preserve">Gemini wire schema  </w:t>
+            </w:r>
+            <w:r>
+              <w:rPr>
+                <w:rFonts w:ascii="Calibri" w:hAnsi="Calibri" w:eastAsia="Yu Gothic"/>
+              </w:rPr>
+              <w:t>Canonical strict schemaとPydantic契約は変更せず、Geminiへ送るwire viewだけからtitle、文字列長/pattern、配列件数制約を除きます。単一anyOfが8 branchを超える場合は送信前に停止します。長いPlaywright台本ではglobal ID allowlistを保持し、paragraph-local相関を決定論的Validatorで検査します。</w:t>
             </w:r>
           </w:p>
         </w:tc>
@@ -8441,7 +8508,7 @@
                 <w:rFonts w:ascii="Calibri" w:hAnsi="Calibri" w:eastAsia="Yu Gothic"/>
                 <w:sz w:val="17"/>
               </w:rPr>
-              <w:t>異なる明示model、一回限り、互換bindingを監査保存</w:t>
+              <w:t>応答契約は異なる明示model。名前付きrequest-schema revisionだけ同一modelを一回許可</w:t>
             </w:r>
           </w:p>
         </w:tc>
@@ -9336,7 +9403,7 @@
                 <w:rFonts w:ascii="Calibri" w:hAnsi="Calibri" w:eastAsia="Yu Gothic"/>
                 <w:sz w:val="16"/>
               </w:rPr>
-              <w:t>--producer-recover、--producer-revise、--producer-provider-retry、--producer-output-repair</w:t>
+              <w:t>--producer-recover、--producer-revise、--producer-provider-retry、--producer-retrieval-retry、--producer-output-repair</w:t>
             </w:r>
           </w:p>
         </w:tc>
@@ -9444,7 +9511,7 @@
                 <w:rFonts w:ascii="Calibri" w:hAnsi="Calibri" w:eastAsia="Yu Gothic"/>
                 <w:sz w:val="16"/>
               </w:rPr>
-              <w:t>--deliberation、--deliberation-resume、--deliberation-recover、--deliberation-revise、--deliberation-provider-retry</w:t>
+              <w:t>--deliberation、--deliberation-resume、--deliberation-recover、--deliberation-revise、--deliberation-provider-retry、--deliberation-contract-repair</w:t>
             </w:r>
           </w:p>
         </w:tc>
@@ -9498,7 +9565,7 @@
                 <w:rFonts w:ascii="Calibri" w:hAnsi="Calibri" w:eastAsia="Yu Gothic"/>
                 <w:sz w:val="16"/>
               </w:rPr>
-              <w:t>--conclusion、--conclusion-resume、--conclusion-recover、--conclusion-revise、--conclusion-provider-retry、--conclusion-select、--conclusion-integrate</w:t>
+              <w:t>--conclusion、--conclusion-resume、--conclusion-recover、--conclusion-revise、--conclusion-provider-retry、--conclusion-contract-repair、--conclusion-select、--conclusion-integrate</w:t>
             </w:r>
           </w:p>
         </w:tc>
@@ -9552,7 +9619,7 @@
                 <w:rFonts w:ascii="Calibri" w:hAnsi="Calibri" w:eastAsia="Yu Gothic"/>
                 <w:sz w:val="16"/>
               </w:rPr>
-              <w:t>--playwright、--playwright-resume、--playwright-recover、--playwright-revise、--playwright-provider-retry</w:t>
+              <w:t>--playwright、--playwright-resume、--playwright-recover、--playwright-revise、--playwright-provider-retry、--playwright-capability-repair</w:t>
             </w:r>
           </w:p>
         </w:tc>

</xml_diff>